<commit_message>
actividad de idea terminada
</commit_message>
<xml_diff>
--- a/Teoria General de Sistemas/PPI/PPI Ingeniería Primer Semestre.docx
+++ b/Teoria General de Sistemas/PPI/PPI Ingeniería Primer Semestre.docx
@@ -12006,7 +12006,17 @@
           <w:sz w:val="22"/>
           <w:szCs w:val="22"/>
         </w:rPr>
-        <w:t xml:space="preserve">Rama: </w:t>
+        <w:t>Rol</w:t>
+      </w:r>
+      <w:r>
+        <w:rPr>
+          <w:rFonts w:eastAsiaTheme="minorEastAsia" w:cs="Times New Roman"/>
+          <w:b/>
+          <w:bCs/>
+          <w:sz w:val="22"/>
+          <w:szCs w:val="22"/>
+        </w:rPr>
+        <w:t xml:space="preserve">: </w:t>
       </w:r>
       <w:r>
         <w:rPr>
@@ -12077,7 +12087,17 @@
           <w:sz w:val="22"/>
           <w:szCs w:val="22"/>
         </w:rPr>
-        <w:t xml:space="preserve">Rama: </w:t>
+        <w:t>Rol</w:t>
+      </w:r>
+      <w:r>
+        <w:rPr>
+          <w:rFonts w:eastAsiaTheme="minorEastAsia" w:cs="Times New Roman"/>
+          <w:b/>
+          <w:bCs/>
+          <w:sz w:val="22"/>
+          <w:szCs w:val="22"/>
+        </w:rPr>
+        <w:t xml:space="preserve">: </w:t>
       </w:r>
       <w:r>
         <w:rPr>
@@ -12148,7 +12168,17 @@
           <w:sz w:val="22"/>
           <w:szCs w:val="22"/>
         </w:rPr>
-        <w:t xml:space="preserve">Rama: </w:t>
+        <w:t>Rol</w:t>
+      </w:r>
+      <w:r>
+        <w:rPr>
+          <w:rFonts w:eastAsiaTheme="minorEastAsia" w:cs="Times New Roman"/>
+          <w:b/>
+          <w:bCs/>
+          <w:sz w:val="22"/>
+          <w:szCs w:val="22"/>
+        </w:rPr>
+        <w:t xml:space="preserve">: </w:t>
       </w:r>
       <w:r>
         <w:rPr>
@@ -12219,7 +12249,17 @@
           <w:sz w:val="22"/>
           <w:szCs w:val="22"/>
         </w:rPr>
-        <w:t>Rama:</w:t>
+        <w:t>Rol</w:t>
+      </w:r>
+      <w:r>
+        <w:rPr>
+          <w:rFonts w:eastAsiaTheme="minorEastAsia" w:cs="Times New Roman"/>
+          <w:b/>
+          <w:bCs/>
+          <w:sz w:val="22"/>
+          <w:szCs w:val="22"/>
+        </w:rPr>
+        <w:t>:</w:t>
       </w:r>
       <w:r>
         <w:rPr>
@@ -12288,7 +12328,17 @@
           <w:sz w:val="22"/>
           <w:szCs w:val="22"/>
         </w:rPr>
-        <w:t>Rama:</w:t>
+        <w:t>Rol</w:t>
+      </w:r>
+      <w:r>
+        <w:rPr>
+          <w:rFonts w:eastAsiaTheme="minorEastAsia" w:cs="Times New Roman"/>
+          <w:b/>
+          <w:bCs/>
+          <w:sz w:val="22"/>
+          <w:szCs w:val="22"/>
+        </w:rPr>
+        <w:t>:</w:t>
       </w:r>
       <w:r>
         <w:rPr>
@@ -12361,7 +12411,17 @@
           <w:sz w:val="22"/>
           <w:szCs w:val="22"/>
         </w:rPr>
-        <w:t xml:space="preserve">Rama: </w:t>
+        <w:t>Rol</w:t>
+      </w:r>
+      <w:r>
+        <w:rPr>
+          <w:rFonts w:eastAsiaTheme="minorEastAsia" w:cs="Times New Roman"/>
+          <w:b/>
+          <w:bCs/>
+          <w:sz w:val="22"/>
+          <w:szCs w:val="22"/>
+        </w:rPr>
+        <w:t xml:space="preserve">: </w:t>
       </w:r>
       <w:r>
         <w:rPr>
@@ -12443,11 +12503,21 @@
           <w:sz w:val="22"/>
           <w:szCs w:val="22"/>
         </w:rPr>
-        <w:t xml:space="preserve">Rama: </w:t>
+        <w:t>Rol</w:t>
       </w:r>
       <w:r>
         <w:rPr>
           <w:rFonts w:eastAsiaTheme="minorEastAsia" w:cs="Times New Roman"/>
+          <w:b/>
+          <w:bCs/>
+          <w:sz w:val="22"/>
+          <w:szCs w:val="22"/>
+        </w:rPr>
+        <w:t xml:space="preserve">: </w:t>
+      </w:r>
+      <w:r>
+        <w:rPr>
+          <w:rFonts w:eastAsiaTheme="minorEastAsia" w:cs="Times New Roman"/>
           <w:sz w:val="22"/>
           <w:szCs w:val="22"/>
         </w:rPr>
@@ -12575,7 +12645,17 @@
           <w:sz w:val="22"/>
           <w:szCs w:val="22"/>
         </w:rPr>
-        <w:t xml:space="preserve">Rama: </w:t>
+        <w:t>Rol</w:t>
+      </w:r>
+      <w:r>
+        <w:rPr>
+          <w:rFonts w:eastAsiaTheme="minorEastAsia" w:cs="Times New Roman"/>
+          <w:b/>
+          <w:bCs/>
+          <w:sz w:val="22"/>
+          <w:szCs w:val="22"/>
+        </w:rPr>
+        <w:t xml:space="preserve">: </w:t>
       </w:r>
       <w:r>
         <w:rPr>
@@ -12737,33 +12817,13 @@
           <w:b/>
           <w:bCs/>
         </w:rPr>
-        <w:t>Módulos</w:t>
-      </w:r>
-      <w:r>
-        <w:rPr>
-          <w:rFonts w:ascii="Times New Roman" w:hAnsi="Times New Roman" w:cs="Times New Roman"/>
-          <w:b/>
-          <w:bCs/>
-        </w:rPr>
-        <w:t xml:space="preserve"> asociados:</w:t>
-      </w:r>
-      <w:r>
-        <w:rPr>
-          <w:rFonts w:ascii="Times New Roman" w:hAnsi="Times New Roman" w:cs="Times New Roman"/>
-        </w:rPr>
-        <w:t xml:space="preserve"> Reserva, </w:t>
-      </w:r>
-      <w:r>
-        <w:rPr>
-          <w:rFonts w:ascii="Times New Roman" w:hAnsi="Times New Roman" w:cs="Times New Roman"/>
-        </w:rPr>
-        <w:t>Visualización</w:t>
-      </w:r>
-      <w:r>
-        <w:rPr>
-          <w:rFonts w:ascii="Times New Roman" w:hAnsi="Times New Roman" w:cs="Times New Roman"/>
-        </w:rPr>
-        <w:t xml:space="preserve"> de agenda</w:t>
+        <w:t>Módulos asociados:</w:t>
+      </w:r>
+      <w:r>
+        <w:rPr>
+          <w:rFonts w:ascii="Times New Roman" w:hAnsi="Times New Roman" w:cs="Times New Roman"/>
+        </w:rPr>
+        <w:t xml:space="preserve"> Reserva, Visualización de agenda</w:t>
       </w:r>
     </w:p>
     <w:p>
@@ -12830,22 +12890,76 @@
           <w:b/>
           <w:bCs/>
         </w:rPr>
-        <w:t>Módulos</w:t>
-      </w:r>
-      <w:r>
+        <w:t>Módulos asociados:</w:t>
+      </w:r>
+      <w:r>
+        <w:rPr>
+          <w:rFonts w:ascii="Times New Roman" w:hAnsi="Times New Roman" w:cs="Times New Roman"/>
+        </w:rPr>
+        <w:t xml:space="preserve"> Reserva,</w:t>
+      </w:r>
+    </w:p>
+    <w:p>
+      <w:pPr>
+        <w:pStyle w:val="Textbody"/>
+        <w:rPr>
+          <w:rFonts w:ascii="Times New Roman" w:hAnsi="Times New Roman" w:cs="Times New Roman"/>
+        </w:rPr>
+      </w:pPr>
+      <w:r>
+        <w:rPr>
+          <w:rFonts w:ascii="Times New Roman" w:hAnsi="Times New Roman" w:cs="Times New Roman"/>
+        </w:rPr>
+        <w:t>Inserta un nuevo registro de reserva en la base de datos con los datos de usuario, recurso, fecha y horario, asegurando integridad referencial y confirmando el enví</w:t>
+      </w:r>
+      <w:r>
+        <w:rPr>
+          <w:rFonts w:ascii="Times New Roman" w:hAnsi="Times New Roman" w:cs="Times New Roman"/>
+        </w:rPr>
+        <w:t>o</w:t>
+      </w:r>
+      <w:r>
+        <w:rPr>
+          <w:rFonts w:ascii="Times New Roman" w:hAnsi="Times New Roman" w:cs="Times New Roman"/>
+        </w:rPr>
+        <w:t>.</w:t>
+      </w:r>
+    </w:p>
+    <w:p>
+      <w:pPr>
+        <w:pStyle w:val="Textbody"/>
+        <w:rPr>
+          <w:rFonts w:ascii="Times New Roman" w:hAnsi="Times New Roman" w:cs="Times New Roman"/>
+        </w:rPr>
+      </w:pPr>
+    </w:p>
+    <w:p>
+      <w:pPr>
+        <w:pStyle w:val="Textbody"/>
         <w:rPr>
           <w:rFonts w:ascii="Times New Roman" w:hAnsi="Times New Roman" w:cs="Times New Roman"/>
           <w:b/>
           <w:bCs/>
         </w:rPr>
-        <w:t xml:space="preserve"> asociados:</w:t>
-      </w:r>
-      <w:r>
-        <w:rPr>
-          <w:rFonts w:ascii="Times New Roman" w:hAnsi="Times New Roman" w:cs="Times New Roman"/>
-        </w:rPr>
-        <w:t xml:space="preserve"> Reserva,</w:t>
-      </w:r>
+      </w:pPr>
+      <w:r>
+        <w:rPr>
+          <w:rFonts w:ascii="Times New Roman" w:hAnsi="Times New Roman" w:cs="Times New Roman"/>
+          <w:b/>
+          <w:bCs/>
+        </w:rPr>
+        <w:t xml:space="preserve">Función: </w:t>
+      </w:r>
+      <w:proofErr w:type="spellStart"/>
+      <w:r>
+        <w:rPr>
+          <w:rFonts w:ascii="Times New Roman" w:hAnsi="Times New Roman" w:cs="Times New Roman"/>
+          <w:b/>
+          <w:bCs/>
+        </w:rPr>
+        <w:t>consultarVideojuegos</w:t>
+      </w:r>
+      <w:proofErr w:type="spellEnd"/>
     </w:p>
     <w:p>
       <w:pPr>
@@ -12857,26 +12971,16 @@
       <w:r>
         <w:rPr>
           <w:rFonts w:ascii="Times New Roman" w:hAnsi="Times New Roman" w:cs="Times New Roman"/>
-        </w:rPr>
-        <w:t xml:space="preserve">Inserta un nuevo registro de reserva en la base de datos con los datos de usuario, recurso, fecha y horario, asegurando integridad referencial y confirmando el </w:t>
-      </w:r>
-      <w:r>
-        <w:rPr>
-          <w:rFonts w:ascii="Times New Roman" w:hAnsi="Times New Roman" w:cs="Times New Roman"/>
-        </w:rPr>
-        <w:t>enví</w:t>
-      </w:r>
-      <w:r>
-        <w:rPr>
-          <w:rFonts w:ascii="Times New Roman" w:hAnsi="Times New Roman" w:cs="Times New Roman"/>
-        </w:rPr>
-        <w:t>o</w:t>
-      </w:r>
-      <w:r>
-        <w:rPr>
-          <w:rFonts w:ascii="Times New Roman" w:hAnsi="Times New Roman" w:cs="Times New Roman"/>
-        </w:rPr>
-        <w:t>.</w:t>
+          <w:b/>
+          <w:bCs/>
+        </w:rPr>
+        <w:t>Módulos asociados:</w:t>
+      </w:r>
+      <w:r>
+        <w:rPr>
+          <w:rFonts w:ascii="Times New Roman" w:hAnsi="Times New Roman" w:cs="Times New Roman"/>
+        </w:rPr>
+        <w:t xml:space="preserve"> Submódulo de consulta de videojuegos</w:t>
       </w:r>
     </w:p>
     <w:p>
@@ -12886,6 +12990,42 @@
           <w:rFonts w:ascii="Times New Roman" w:hAnsi="Times New Roman" w:cs="Times New Roman"/>
         </w:rPr>
       </w:pPr>
+      <w:r>
+        <w:rPr>
+          <w:rFonts w:ascii="Times New Roman" w:hAnsi="Times New Roman" w:cs="Times New Roman"/>
+        </w:rPr>
+        <w:t>Realiza una petición tipo GET a la API para obtener información de videojuegos, incluyendo nombre, foto,</w:t>
+      </w:r>
+      <w:r>
+        <w:rPr>
+          <w:rFonts w:ascii="Times New Roman" w:hAnsi="Times New Roman" w:cs="Times New Roman"/>
+        </w:rPr>
+        <w:t xml:space="preserve"> </w:t>
+      </w:r>
+      <w:r>
+        <w:rPr>
+          <w:rFonts w:ascii="Times New Roman" w:hAnsi="Times New Roman" w:cs="Times New Roman"/>
+        </w:rPr>
+        <w:t xml:space="preserve">versión, recurso asociado y descripción, utilizando como parámetros los resultados generados por la función </w:t>
+      </w:r>
+      <w:proofErr w:type="spellStart"/>
+      <w:r>
+        <w:rPr>
+          <w:rFonts w:ascii="Times New Roman" w:hAnsi="Times New Roman" w:cs="Times New Roman"/>
+          <w:b/>
+          <w:bCs/>
+        </w:rPr>
+        <w:t>filtrarVideojuegos</w:t>
+      </w:r>
+      <w:proofErr w:type="spellEnd"/>
+      <w:r>
+        <w:rPr>
+          <w:rFonts w:ascii="Times New Roman" w:hAnsi="Times New Roman" w:cs="Times New Roman"/>
+          <w:b/>
+          <w:bCs/>
+        </w:rPr>
+        <w:t xml:space="preserve"> </w:t>
+      </w:r>
     </w:p>
     <w:p>
       <w:pPr>
@@ -12896,12 +13036,22 @@
           <w:bCs/>
         </w:rPr>
       </w:pPr>
-      <w:r>
+    </w:p>
+    <w:p>
+      <w:pPr>
+        <w:pStyle w:val="Textbody"/>
         <w:rPr>
           <w:rFonts w:ascii="Times New Roman" w:hAnsi="Times New Roman" w:cs="Times New Roman"/>
           <w:b/>
           <w:bCs/>
         </w:rPr>
+      </w:pPr>
+      <w:r>
+        <w:rPr>
+          <w:rFonts w:ascii="Times New Roman" w:hAnsi="Times New Roman" w:cs="Times New Roman"/>
+          <w:b/>
+          <w:bCs/>
+        </w:rPr>
         <w:t xml:space="preserve">Función: </w:t>
       </w:r>
       <w:proofErr w:type="spellStart"/>
@@ -12911,7 +13061,7 @@
           <w:b/>
           <w:bCs/>
         </w:rPr>
-        <w:t>consultarVideojuegos</w:t>
+        <w:t>filtrarVideojuegos</w:t>
       </w:r>
       <w:proofErr w:type="spellEnd"/>
     </w:p>
@@ -12929,118 +13079,6 @@
           <w:bCs/>
         </w:rPr>
         <w:t>Módulos asociados:</w:t>
-      </w:r>
-      <w:r>
-        <w:rPr>
-          <w:rFonts w:ascii="Times New Roman" w:hAnsi="Times New Roman" w:cs="Times New Roman"/>
-        </w:rPr>
-        <w:t xml:space="preserve"> Submódulo de consulta de videojuegos</w:t>
-      </w:r>
-    </w:p>
-    <w:p>
-      <w:pPr>
-        <w:pStyle w:val="Textbody"/>
-        <w:rPr>
-          <w:rFonts w:ascii="Times New Roman" w:hAnsi="Times New Roman" w:cs="Times New Roman"/>
-        </w:rPr>
-      </w:pPr>
-      <w:r>
-        <w:rPr>
-          <w:rFonts w:ascii="Times New Roman" w:hAnsi="Times New Roman" w:cs="Times New Roman"/>
-        </w:rPr>
-        <w:t>Realiza una petición tipo GET a la API para obtener información de videojuegos, incluyendo nombre, foto,</w:t>
-      </w:r>
-      <w:r>
-        <w:rPr>
-          <w:rFonts w:ascii="Times New Roman" w:hAnsi="Times New Roman" w:cs="Times New Roman"/>
-        </w:rPr>
-        <w:t xml:space="preserve"> </w:t>
-      </w:r>
-      <w:r>
-        <w:rPr>
-          <w:rFonts w:ascii="Times New Roman" w:hAnsi="Times New Roman" w:cs="Times New Roman"/>
-        </w:rPr>
-        <w:t xml:space="preserve">versión, recurso asociado y descripción, utilizando como parámetros los resultados generados por la función </w:t>
-      </w:r>
-      <w:proofErr w:type="spellStart"/>
-      <w:r>
-        <w:rPr>
-          <w:rFonts w:ascii="Times New Roman" w:hAnsi="Times New Roman" w:cs="Times New Roman"/>
-          <w:b/>
-          <w:bCs/>
-        </w:rPr>
-        <w:t>filtrarVideojuegos</w:t>
-      </w:r>
-      <w:proofErr w:type="spellEnd"/>
-      <w:r>
-        <w:rPr>
-          <w:rFonts w:ascii="Times New Roman" w:hAnsi="Times New Roman" w:cs="Times New Roman"/>
-          <w:b/>
-          <w:bCs/>
-        </w:rPr>
-        <w:t xml:space="preserve"> </w:t>
-      </w:r>
-    </w:p>
-    <w:p>
-      <w:pPr>
-        <w:pStyle w:val="Textbody"/>
-        <w:rPr>
-          <w:rFonts w:ascii="Times New Roman" w:hAnsi="Times New Roman" w:cs="Times New Roman"/>
-          <w:b/>
-          <w:bCs/>
-        </w:rPr>
-      </w:pPr>
-    </w:p>
-    <w:p>
-      <w:pPr>
-        <w:pStyle w:val="Textbody"/>
-        <w:rPr>
-          <w:rFonts w:ascii="Times New Roman" w:hAnsi="Times New Roman" w:cs="Times New Roman"/>
-          <w:b/>
-          <w:bCs/>
-        </w:rPr>
-      </w:pPr>
-      <w:r>
-        <w:rPr>
-          <w:rFonts w:ascii="Times New Roman" w:hAnsi="Times New Roman" w:cs="Times New Roman"/>
-          <w:b/>
-          <w:bCs/>
-        </w:rPr>
-        <w:t xml:space="preserve">Función: </w:t>
-      </w:r>
-      <w:proofErr w:type="spellStart"/>
-      <w:r>
-        <w:rPr>
-          <w:rFonts w:ascii="Times New Roman" w:hAnsi="Times New Roman" w:cs="Times New Roman"/>
-          <w:b/>
-          <w:bCs/>
-        </w:rPr>
-        <w:t>filtrarVideojuegos</w:t>
-      </w:r>
-      <w:proofErr w:type="spellEnd"/>
-    </w:p>
-    <w:p>
-      <w:pPr>
-        <w:pStyle w:val="Textbody"/>
-        <w:rPr>
-          <w:rFonts w:ascii="Times New Roman" w:hAnsi="Times New Roman" w:cs="Times New Roman"/>
-        </w:rPr>
-      </w:pPr>
-      <w:r>
-        <w:rPr>
-          <w:rFonts w:ascii="Times New Roman" w:hAnsi="Times New Roman" w:cs="Times New Roman"/>
-          <w:b/>
-          <w:bCs/>
-        </w:rPr>
-        <w:t>Módulos</w:t>
-      </w:r>
-      <w:r>
-        <w:rPr>
-          <w:rFonts w:ascii="Times New Roman" w:hAnsi="Times New Roman" w:cs="Times New Roman"/>
-          <w:b/>
-          <w:bCs/>
-        </w:rPr>
-        <w:t xml:space="preserve"> asociados:</w:t>
       </w:r>
       <w:r>
         <w:rPr>
@@ -14303,11 +14341,11 @@
           <w:lang w:val="es-CO"/>
         </w:rPr>
       </w:pPr>
-      <w:bookmarkStart w:id="37" w:name="_Toc96339539"/>
-      <w:bookmarkStart w:id="38" w:name="__RefHeading__10986_300738085"/>
-      <w:bookmarkStart w:id="39" w:name="__RefHeading__11034_300738085"/>
+      <w:bookmarkStart w:id="37" w:name="__RefHeading__10986_300738085"/>
+      <w:bookmarkStart w:id="38" w:name="__RefHeading__11034_300738085"/>
+      <w:bookmarkStart w:id="39" w:name="_Toc96339539"/>
+      <w:bookmarkEnd w:id="37"/>
       <w:bookmarkEnd w:id="38"/>
-      <w:bookmarkEnd w:id="39"/>
       <w:proofErr w:type="spellStart"/>
       <w:r>
         <w:rPr>
@@ -15427,7 +15465,7 @@
         </w:rPr>
         <w:t>.</w:t>
       </w:r>
-      <w:bookmarkEnd w:id="37"/>
+      <w:bookmarkEnd w:id="39"/>
     </w:p>
     <w:p>
       <w:pPr>

</xml_diff>

<commit_message>
se añadio correccion de funciones y cronograma actualizado
</commit_message>
<xml_diff>
--- a/Teoria General de Sistemas/PPI/PPI Ingeniería Primer Semestre.docx
+++ b/Teoria General de Sistemas/PPI/PPI Ingeniería Primer Semestre.docx
@@ -12791,6 +12791,105 @@
           <w:b/>
           <w:bCs/>
         </w:rPr>
+        <w:t>Función: Registrar una reserva</w:t>
+      </w:r>
+    </w:p>
+    <w:p>
+      <w:pPr>
+        <w:pStyle w:val="Textbody"/>
+        <w:rPr>
+          <w:rFonts w:ascii="Times New Roman" w:hAnsi="Times New Roman" w:cs="Times New Roman"/>
+          <w:b/>
+          <w:bCs/>
+        </w:rPr>
+      </w:pPr>
+      <w:r>
+        <w:rPr>
+          <w:rFonts w:ascii="Times New Roman" w:hAnsi="Times New Roman" w:cs="Times New Roman"/>
+          <w:b/>
+          <w:bCs/>
+        </w:rPr>
+        <w:t xml:space="preserve">Módulos asociados: </w:t>
+      </w:r>
+      <w:r>
+        <w:rPr>
+          <w:rFonts w:ascii="Times New Roman" w:hAnsi="Times New Roman" w:cs="Times New Roman"/>
+        </w:rPr>
+        <w:t>Agenda</w:t>
+      </w:r>
+    </w:p>
+    <w:p>
+      <w:pPr>
+        <w:pStyle w:val="Textbody"/>
+        <w:rPr>
+          <w:rFonts w:ascii="Times New Roman" w:hAnsi="Times New Roman" w:cs="Times New Roman"/>
+        </w:rPr>
+      </w:pPr>
+      <w:r>
+        <w:rPr>
+          <w:rFonts w:ascii="Times New Roman" w:hAnsi="Times New Roman" w:cs="Times New Roman"/>
+        </w:rPr>
+        <w:t>Al ingresar al módulo de agenda, el usuario visualiza un calendario interactivo que muestra el mes en curso, donde puede seleccionar el día en el que desea realizar la reserva. Al seleccionar una fecha, el sistema despliega un catálogo de equipos disponibles (PS5 o PC) mediante tarjetas seleccionables.</w:t>
+      </w:r>
+    </w:p>
+    <w:p>
+      <w:pPr>
+        <w:pStyle w:val="Textbody"/>
+        <w:rPr>
+          <w:rFonts w:ascii="Times New Roman" w:hAnsi="Times New Roman" w:cs="Times New Roman"/>
+        </w:rPr>
+      </w:pPr>
+      <w:r>
+        <w:rPr>
+          <w:rFonts w:ascii="Times New Roman" w:hAnsi="Times New Roman" w:cs="Times New Roman"/>
+        </w:rPr>
+        <w:t xml:space="preserve">Una vez elegido el tipo de equipo, se presenta una vista de horarios organizada en columnas (equipos) </w:t>
+      </w:r>
+      <w:r>
+        <w:rPr>
+          <w:rFonts w:ascii="Times New Roman" w:hAnsi="Times New Roman" w:cs="Times New Roman"/>
+        </w:rPr>
+        <w:lastRenderedPageBreak/>
+        <w:t>y filas (franjas horarias), donde la disponibilidad se indica visualmente mediante colores (rojo para no disponible y verde para disponible).</w:t>
+      </w:r>
+    </w:p>
+    <w:p>
+      <w:pPr>
+        <w:pStyle w:val="Textbody"/>
+        <w:rPr>
+          <w:rFonts w:ascii="Times New Roman" w:hAnsi="Times New Roman" w:cs="Times New Roman"/>
+        </w:rPr>
+      </w:pPr>
+      <w:r>
+        <w:rPr>
+          <w:rFonts w:ascii="Times New Roman" w:hAnsi="Times New Roman" w:cs="Times New Roman"/>
+        </w:rPr>
+        <w:t>Finalmente, el usuario accede a un formulario en el que ingresa datos como número de personas y tiempo de uso, junto con la visualización de la fecha y hora seleccionadas, para confirmar la reserva mediante un mensaje previo de validación.</w:t>
+      </w:r>
+    </w:p>
+    <w:p>
+      <w:pPr>
+        <w:pStyle w:val="Textbody"/>
+        <w:rPr>
+          <w:rFonts w:ascii="Times New Roman" w:hAnsi="Times New Roman" w:cs="Times New Roman"/>
+        </w:rPr>
+      </w:pPr>
+    </w:p>
+    <w:p>
+      <w:pPr>
+        <w:pStyle w:val="Textbody"/>
+        <w:rPr>
+          <w:rFonts w:ascii="Times New Roman" w:hAnsi="Times New Roman" w:cs="Times New Roman"/>
+          <w:b/>
+          <w:bCs/>
+        </w:rPr>
+      </w:pPr>
+      <w:r>
+        <w:rPr>
+          <w:rFonts w:ascii="Times New Roman" w:hAnsi="Times New Roman" w:cs="Times New Roman"/>
+          <w:b/>
+          <w:bCs/>
+        </w:rPr>
         <w:t xml:space="preserve">Función: </w:t>
       </w:r>
       <w:proofErr w:type="spellStart"/>
@@ -12863,7 +12962,559 @@
           <w:b/>
           <w:bCs/>
         </w:rPr>
+        <w:t xml:space="preserve">Función: </w:t>
+      </w:r>
+      <w:proofErr w:type="spellStart"/>
+      <w:r>
+        <w:rPr>
+          <w:rFonts w:ascii="Times New Roman" w:hAnsi="Times New Roman" w:cs="Times New Roman"/>
+          <w:b/>
+          <w:bCs/>
+        </w:rPr>
+        <w:t>consultarVideojuegos</w:t>
+      </w:r>
+      <w:proofErr w:type="spellEnd"/>
+    </w:p>
+    <w:p>
+      <w:pPr>
+        <w:pStyle w:val="Textbody"/>
+        <w:rPr>
+          <w:rFonts w:ascii="Times New Roman" w:hAnsi="Times New Roman" w:cs="Times New Roman"/>
+        </w:rPr>
+      </w:pPr>
+      <w:r>
+        <w:rPr>
+          <w:rFonts w:ascii="Times New Roman" w:hAnsi="Times New Roman" w:cs="Times New Roman"/>
+          <w:b/>
+          <w:bCs/>
+        </w:rPr>
+        <w:t>Módulos asociados:</w:t>
+      </w:r>
+      <w:r>
+        <w:rPr>
+          <w:rFonts w:ascii="Times New Roman" w:hAnsi="Times New Roman" w:cs="Times New Roman"/>
+        </w:rPr>
+        <w:t xml:space="preserve"> Submódulo de consulta de videojuegos</w:t>
+      </w:r>
+    </w:p>
+    <w:p>
+      <w:pPr>
+        <w:pStyle w:val="Textbody"/>
+        <w:rPr>
+          <w:rFonts w:ascii="Times New Roman" w:hAnsi="Times New Roman" w:cs="Times New Roman"/>
+        </w:rPr>
+      </w:pPr>
+      <w:r>
+        <w:rPr>
+          <w:rFonts w:ascii="Times New Roman" w:hAnsi="Times New Roman" w:cs="Times New Roman"/>
+        </w:rPr>
+        <w:t>Realiza una petición tipo GET a la API para obtener información de videojuegos, incluyendo nombre, foto,</w:t>
+      </w:r>
+      <w:r>
+        <w:rPr>
+          <w:rFonts w:ascii="Times New Roman" w:hAnsi="Times New Roman" w:cs="Times New Roman"/>
+        </w:rPr>
+        <w:t xml:space="preserve"> </w:t>
+      </w:r>
+      <w:r>
+        <w:rPr>
+          <w:rFonts w:ascii="Times New Roman" w:hAnsi="Times New Roman" w:cs="Times New Roman"/>
+        </w:rPr>
+        <w:t xml:space="preserve">versión, recurso asociado y descripción, utilizando como parámetros los resultados generados por la función </w:t>
+      </w:r>
+      <w:proofErr w:type="spellStart"/>
+      <w:r>
+        <w:rPr>
+          <w:rFonts w:ascii="Times New Roman" w:hAnsi="Times New Roman" w:cs="Times New Roman"/>
+          <w:b/>
+          <w:bCs/>
+        </w:rPr>
+        <w:t>filtrarVideojuegos</w:t>
+      </w:r>
+      <w:proofErr w:type="spellEnd"/>
+      <w:r>
+        <w:rPr>
+          <w:rFonts w:ascii="Times New Roman" w:hAnsi="Times New Roman" w:cs="Times New Roman"/>
+          <w:b/>
+          <w:bCs/>
+        </w:rPr>
+        <w:t xml:space="preserve"> </w:t>
+      </w:r>
+    </w:p>
+    <w:p>
+      <w:pPr>
+        <w:pStyle w:val="Textbody"/>
+        <w:rPr>
+          <w:rFonts w:ascii="Times New Roman" w:hAnsi="Times New Roman" w:cs="Times New Roman"/>
+          <w:b/>
+          <w:bCs/>
+        </w:rPr>
+      </w:pPr>
+    </w:p>
+    <w:p>
+      <w:pPr>
+        <w:pStyle w:val="Textbody"/>
+        <w:rPr>
+          <w:rFonts w:ascii="Times New Roman" w:hAnsi="Times New Roman" w:cs="Times New Roman"/>
+          <w:b/>
+          <w:bCs/>
+        </w:rPr>
+      </w:pPr>
+      <w:r>
+        <w:rPr>
+          <w:rFonts w:ascii="Times New Roman" w:hAnsi="Times New Roman" w:cs="Times New Roman"/>
+          <w:b/>
+          <w:bCs/>
+        </w:rPr>
+        <w:t xml:space="preserve">Función: </w:t>
+      </w:r>
+      <w:proofErr w:type="spellStart"/>
+      <w:r>
+        <w:rPr>
+          <w:rFonts w:ascii="Times New Roman" w:hAnsi="Times New Roman" w:cs="Times New Roman"/>
+          <w:b/>
+          <w:bCs/>
+        </w:rPr>
+        <w:t>filtrarVideojuegos</w:t>
+      </w:r>
+      <w:proofErr w:type="spellEnd"/>
+    </w:p>
+    <w:p>
+      <w:pPr>
+        <w:pStyle w:val="Textbody"/>
+        <w:rPr>
+          <w:rFonts w:ascii="Times New Roman" w:hAnsi="Times New Roman" w:cs="Times New Roman"/>
+        </w:rPr>
+      </w:pPr>
+      <w:r>
+        <w:rPr>
+          <w:rFonts w:ascii="Times New Roman" w:hAnsi="Times New Roman" w:cs="Times New Roman"/>
+          <w:b/>
+          <w:bCs/>
+        </w:rPr>
+        <w:t>Módulos asociados:</w:t>
+      </w:r>
+      <w:r>
+        <w:rPr>
+          <w:rFonts w:ascii="Times New Roman" w:hAnsi="Times New Roman" w:cs="Times New Roman"/>
+        </w:rPr>
+        <w:t xml:space="preserve"> </w:t>
+      </w:r>
+      <w:r>
+        <w:rPr>
+          <w:rFonts w:ascii="Times New Roman" w:hAnsi="Times New Roman" w:cs="Times New Roman"/>
+        </w:rPr>
+        <w:t>submódulo</w:t>
+      </w:r>
+      <w:r>
+        <w:rPr>
+          <w:rFonts w:ascii="Times New Roman" w:hAnsi="Times New Roman" w:cs="Times New Roman"/>
+        </w:rPr>
+        <w:t xml:space="preserve"> de </w:t>
+      </w:r>
+      <w:r>
+        <w:rPr>
+          <w:rFonts w:ascii="Times New Roman" w:hAnsi="Times New Roman" w:cs="Times New Roman"/>
+        </w:rPr>
+        <w:t>consulta</w:t>
+      </w:r>
+      <w:r>
+        <w:rPr>
+          <w:rFonts w:ascii="Times New Roman" w:hAnsi="Times New Roman" w:cs="Times New Roman"/>
+        </w:rPr>
+        <w:t xml:space="preserve"> de videojuegos</w:t>
+      </w:r>
+    </w:p>
+    <w:p>
+      <w:pPr>
+        <w:pStyle w:val="Textbody"/>
+        <w:rPr>
+          <w:rFonts w:ascii="Times New Roman" w:hAnsi="Times New Roman" w:cs="Times New Roman"/>
+        </w:rPr>
+      </w:pPr>
+      <w:r>
+        <w:rPr>
+          <w:rFonts w:ascii="Times New Roman" w:hAnsi="Times New Roman" w:cs="Times New Roman"/>
+        </w:rPr>
+        <w:t xml:space="preserve">Procesa, con base en filtros definidos en el DOM, un conjunto de parámetros que son enviados a la función </w:t>
+      </w:r>
+      <w:proofErr w:type="spellStart"/>
+      <w:r>
+        <w:rPr>
+          <w:rFonts w:ascii="Times New Roman" w:hAnsi="Times New Roman" w:cs="Times New Roman"/>
+          <w:b/>
+          <w:bCs/>
+        </w:rPr>
+        <w:t>consultarVideojuegos</w:t>
+      </w:r>
+      <w:proofErr w:type="spellEnd"/>
+      <w:r>
+        <w:rPr>
+          <w:rFonts w:ascii="Times New Roman" w:hAnsi="Times New Roman" w:cs="Times New Roman"/>
+        </w:rPr>
+        <w:t xml:space="preserve"> para la ejecución de consultas personalizadas, permitiendo obtener información de videojuegos de forma filtrada y estructurada.</w:t>
+      </w:r>
+    </w:p>
+    <w:p>
+      <w:pPr>
+        <w:pStyle w:val="Textbody"/>
+        <w:rPr>
+          <w:rFonts w:ascii="Times New Roman" w:hAnsi="Times New Roman" w:cs="Times New Roman"/>
+          <w:b/>
+          <w:bCs/>
+        </w:rPr>
+      </w:pPr>
+    </w:p>
+    <w:p>
+      <w:pPr>
+        <w:pStyle w:val="Textbody"/>
+        <w:rPr>
+          <w:rFonts w:ascii="Times New Roman" w:hAnsi="Times New Roman" w:cs="Times New Roman"/>
+          <w:b/>
+          <w:bCs/>
+        </w:rPr>
+      </w:pPr>
+      <w:r>
+        <w:rPr>
+          <w:rFonts w:ascii="Times New Roman" w:hAnsi="Times New Roman" w:cs="Times New Roman"/>
+          <w:b/>
+          <w:bCs/>
+        </w:rPr>
+        <w:t xml:space="preserve">Función: </w:t>
+      </w:r>
+      <w:proofErr w:type="spellStart"/>
+      <w:r>
+        <w:rPr>
+          <w:rFonts w:ascii="Times New Roman" w:hAnsi="Times New Roman" w:cs="Times New Roman"/>
+          <w:b/>
+          <w:bCs/>
+        </w:rPr>
+        <w:t>registrarNuevoUsuario</w:t>
+      </w:r>
+      <w:proofErr w:type="spellEnd"/>
+    </w:p>
+    <w:p>
+      <w:pPr>
+        <w:pStyle w:val="Textbody"/>
+        <w:rPr>
+          <w:rFonts w:ascii="Times New Roman" w:hAnsi="Times New Roman" w:cs="Times New Roman"/>
+        </w:rPr>
+      </w:pPr>
+      <w:r>
+        <w:rPr>
+          <w:rFonts w:ascii="Times New Roman" w:hAnsi="Times New Roman" w:cs="Times New Roman"/>
+          <w:b/>
+          <w:bCs/>
+        </w:rPr>
+        <w:t>Módulos asociados:</w:t>
+      </w:r>
+      <w:r>
+        <w:rPr>
+          <w:rFonts w:ascii="Times New Roman" w:hAnsi="Times New Roman" w:cs="Times New Roman"/>
+        </w:rPr>
+        <w:t xml:space="preserve"> </w:t>
+      </w:r>
+      <w:proofErr w:type="spellStart"/>
+      <w:r>
+        <w:rPr>
+          <w:rFonts w:ascii="Times New Roman" w:hAnsi="Times New Roman" w:cs="Times New Roman"/>
+        </w:rPr>
+        <w:t>Login</w:t>
+      </w:r>
+      <w:proofErr w:type="spellEnd"/>
+    </w:p>
+    <w:p>
+      <w:pPr>
+        <w:pStyle w:val="Textbody"/>
+        <w:rPr>
+          <w:rFonts w:ascii="Times New Roman" w:hAnsi="Times New Roman" w:cs="Times New Roman"/>
+        </w:rPr>
+      </w:pPr>
+      <w:r>
+        <w:rPr>
+          <w:rFonts w:ascii="Times New Roman" w:hAnsi="Times New Roman" w:cs="Times New Roman"/>
+        </w:rPr>
+        <w:t>Realiza una petición tipo POST a la API para crear un nuevo registro de usuario en la base de datos, enviando información como nombre, correo, facultad, carnet institucional, cédula y carrera</w:t>
+      </w:r>
+    </w:p>
+    <w:p>
+      <w:pPr>
+        <w:pStyle w:val="Textbody"/>
+        <w:rPr>
+          <w:rFonts w:ascii="Times New Roman" w:hAnsi="Times New Roman" w:cs="Times New Roman"/>
+        </w:rPr>
+      </w:pPr>
+    </w:p>
+    <w:p>
+      <w:pPr>
+        <w:pStyle w:val="Textbody"/>
+        <w:rPr>
+          <w:rFonts w:ascii="Times New Roman" w:hAnsi="Times New Roman" w:cs="Times New Roman"/>
+          <w:b/>
+          <w:bCs/>
+        </w:rPr>
+      </w:pPr>
+      <w:r>
+        <w:rPr>
+          <w:rFonts w:ascii="Times New Roman" w:hAnsi="Times New Roman" w:cs="Times New Roman"/>
+          <w:b/>
+          <w:bCs/>
+        </w:rPr>
+        <w:t xml:space="preserve">Función: </w:t>
+      </w:r>
+      <w:proofErr w:type="spellStart"/>
+      <w:r>
+        <w:rPr>
+          <w:rFonts w:ascii="Times New Roman" w:hAnsi="Times New Roman" w:cs="Times New Roman"/>
+          <w:b/>
+          <w:bCs/>
+        </w:rPr>
+        <w:t>consultarEquipos</w:t>
+      </w:r>
+      <w:proofErr w:type="spellEnd"/>
+    </w:p>
+    <w:p>
+      <w:pPr>
+        <w:pStyle w:val="Textbody"/>
+        <w:rPr>
+          <w:rFonts w:ascii="Times New Roman" w:hAnsi="Times New Roman" w:cs="Times New Roman"/>
+        </w:rPr>
+      </w:pPr>
+      <w:r>
+        <w:rPr>
+          <w:rFonts w:ascii="Times New Roman" w:hAnsi="Times New Roman" w:cs="Times New Roman"/>
+          <w:b/>
+          <w:bCs/>
+        </w:rPr>
+        <w:t xml:space="preserve">Módulos asociados: </w:t>
+      </w:r>
+      <w:r>
+        <w:rPr>
+          <w:rFonts w:ascii="Times New Roman" w:hAnsi="Times New Roman" w:cs="Times New Roman"/>
+        </w:rPr>
+        <w:t>Inventarios</w:t>
+      </w:r>
+    </w:p>
+    <w:p>
+      <w:pPr>
+        <w:pStyle w:val="Textbody"/>
+        <w:rPr>
+          <w:rFonts w:ascii="Times New Roman" w:hAnsi="Times New Roman" w:cs="Times New Roman"/>
+        </w:rPr>
+      </w:pPr>
+      <w:r>
+        <w:rPr>
+          <w:rFonts w:ascii="Times New Roman" w:hAnsi="Times New Roman" w:cs="Times New Roman"/>
+        </w:rPr>
+        <w:t xml:space="preserve">Realiza una petición tipo GET a la API para obtener información de los equipos, incluyendo estado, tipo, disponibilidad, periféricos, videojuegos y características asociadas, utilizando como parámetros los resultados generados por la función de </w:t>
+      </w:r>
+      <w:proofErr w:type="spellStart"/>
+      <w:r>
+        <w:rPr>
+          <w:rFonts w:ascii="Times New Roman" w:hAnsi="Times New Roman" w:cs="Times New Roman"/>
+          <w:b/>
+          <w:bCs/>
+        </w:rPr>
+        <w:t>filtrosEquipos</w:t>
+      </w:r>
+      <w:proofErr w:type="spellEnd"/>
+    </w:p>
+    <w:p>
+      <w:pPr>
+        <w:pStyle w:val="Textbody"/>
+        <w:rPr>
+          <w:rFonts w:ascii="Times New Roman" w:hAnsi="Times New Roman" w:cs="Times New Roman"/>
+        </w:rPr>
+      </w:pPr>
+    </w:p>
+    <w:p>
+      <w:pPr>
+        <w:pStyle w:val="Textbody"/>
+        <w:rPr>
+          <w:rFonts w:ascii="Times New Roman" w:hAnsi="Times New Roman" w:cs="Times New Roman"/>
+          <w:b/>
+          <w:bCs/>
+        </w:rPr>
+      </w:pPr>
+      <w:r>
+        <w:rPr>
+          <w:rFonts w:ascii="Times New Roman" w:hAnsi="Times New Roman" w:cs="Times New Roman"/>
+          <w:b/>
+          <w:bCs/>
+        </w:rPr>
+        <w:t xml:space="preserve">Función: </w:t>
+      </w:r>
+      <w:proofErr w:type="spellStart"/>
+      <w:r>
+        <w:rPr>
+          <w:rFonts w:ascii="Times New Roman" w:hAnsi="Times New Roman" w:cs="Times New Roman"/>
+          <w:b/>
+          <w:bCs/>
+        </w:rPr>
+        <w:t>filtrosEquipos</w:t>
+      </w:r>
+      <w:proofErr w:type="spellEnd"/>
+    </w:p>
+    <w:p>
+      <w:pPr>
+        <w:pStyle w:val="Textbody"/>
+        <w:rPr>
+          <w:rFonts w:ascii="Times New Roman" w:hAnsi="Times New Roman" w:cs="Times New Roman"/>
+        </w:rPr>
+      </w:pPr>
+      <w:r>
+        <w:rPr>
+          <w:rFonts w:ascii="Times New Roman" w:hAnsi="Times New Roman" w:cs="Times New Roman"/>
+          <w:b/>
+          <w:bCs/>
+        </w:rPr>
+        <w:t>Módulos asociados:</w:t>
+      </w:r>
+      <w:r>
+        <w:rPr>
+          <w:rFonts w:ascii="Times New Roman" w:hAnsi="Times New Roman" w:cs="Times New Roman"/>
+        </w:rPr>
+        <w:t xml:space="preserve"> Inventarios</w:t>
+      </w:r>
+    </w:p>
+    <w:p>
+      <w:pPr>
+        <w:pStyle w:val="Textbody"/>
+        <w:rPr>
+          <w:rFonts w:ascii="Times New Roman" w:hAnsi="Times New Roman" w:cs="Times New Roman"/>
+        </w:rPr>
+      </w:pPr>
+      <w:r>
+        <w:rPr>
+          <w:rFonts w:ascii="Times New Roman" w:hAnsi="Times New Roman" w:cs="Times New Roman"/>
+        </w:rPr>
+        <w:t xml:space="preserve">Procesa, con base en filtros definidos en el DOM, un conjunto de parámetros que son enviados a la función </w:t>
+      </w:r>
+      <w:proofErr w:type="spellStart"/>
+      <w:r>
+        <w:rPr>
+          <w:rFonts w:ascii="Times New Roman" w:hAnsi="Times New Roman" w:cs="Times New Roman"/>
+          <w:b/>
+          <w:bCs/>
+        </w:rPr>
+        <w:t>consultarEquipo</w:t>
+      </w:r>
+      <w:r>
+        <w:rPr>
+          <w:rFonts w:ascii="Times New Roman" w:hAnsi="Times New Roman" w:cs="Times New Roman"/>
+        </w:rPr>
+        <w:t>s</w:t>
+      </w:r>
+      <w:proofErr w:type="spellEnd"/>
+      <w:r>
+        <w:rPr>
+          <w:rFonts w:ascii="Times New Roman" w:hAnsi="Times New Roman" w:cs="Times New Roman"/>
+        </w:rPr>
+        <w:t xml:space="preserve"> para la ejecución de consultas personalizadas</w:t>
+      </w:r>
+    </w:p>
+    <w:p>
+      <w:pPr>
+        <w:pStyle w:val="Textbody"/>
+        <w:rPr>
+          <w:rFonts w:ascii="Times New Roman" w:hAnsi="Times New Roman" w:cs="Times New Roman"/>
+        </w:rPr>
+      </w:pPr>
+    </w:p>
+    <w:p>
+      <w:pPr>
+        <w:pStyle w:val="Textbody"/>
+        <w:rPr>
+          <w:rFonts w:ascii="Times New Roman" w:hAnsi="Times New Roman" w:cs="Times New Roman"/>
+          <w:b/>
+          <w:bCs/>
+        </w:rPr>
+      </w:pPr>
+      <w:r>
+        <w:rPr>
+          <w:rFonts w:ascii="Times New Roman" w:hAnsi="Times New Roman" w:cs="Times New Roman"/>
+          <w:b/>
+          <w:bCs/>
+        </w:rPr>
+        <w:t xml:space="preserve">Función: </w:t>
+      </w:r>
+      <w:proofErr w:type="spellStart"/>
+      <w:r>
+        <w:rPr>
+          <w:rFonts w:ascii="Times New Roman" w:hAnsi="Times New Roman" w:cs="Times New Roman"/>
+          <w:b/>
+          <w:bCs/>
+        </w:rPr>
+        <w:t>enviarNoticias</w:t>
+      </w:r>
+      <w:proofErr w:type="spellEnd"/>
+    </w:p>
+    <w:p>
+      <w:pPr>
+        <w:pStyle w:val="Textbody"/>
+        <w:rPr>
+          <w:rFonts w:ascii="Times New Roman" w:hAnsi="Times New Roman" w:cs="Times New Roman"/>
+        </w:rPr>
+      </w:pPr>
+      <w:r>
+        <w:rPr>
+          <w:rFonts w:ascii="Times New Roman" w:hAnsi="Times New Roman" w:cs="Times New Roman"/>
+          <w:b/>
+          <w:bCs/>
+        </w:rPr>
+        <w:t>Módulos asociados:</w:t>
+      </w:r>
+      <w:r>
+        <w:rPr>
+          <w:rFonts w:ascii="Times New Roman" w:hAnsi="Times New Roman" w:cs="Times New Roman"/>
+        </w:rPr>
+        <w:t xml:space="preserve"> Submódulo de adjunción de noticias</w:t>
+      </w:r>
+    </w:p>
+    <w:p>
+      <w:pPr>
+        <w:pStyle w:val="Textbody"/>
+        <w:rPr>
+          <w:rFonts w:ascii="Times New Roman" w:hAnsi="Times New Roman" w:cs="Times New Roman"/>
+        </w:rPr>
+      </w:pPr>
+      <w:r>
+        <w:rPr>
+          <w:rFonts w:ascii="Times New Roman" w:hAnsi="Times New Roman" w:cs="Times New Roman"/>
+        </w:rPr>
         <w:lastRenderedPageBreak/>
+        <w:t>Procesa, a través del DOM, la información ingresada por el administrador (título, descripción, imágenes y datos asociados), generando una clave de validación de recepción y realizando una petición tipo POST a la API para almacenar la noticia</w:t>
+      </w:r>
+      <w:r>
+        <w:rPr>
+          <w:rFonts w:ascii="Times New Roman" w:hAnsi="Times New Roman" w:cs="Times New Roman"/>
+        </w:rPr>
+        <w:t>.</w:t>
+      </w:r>
+    </w:p>
+    <w:p>
+      <w:pPr>
+        <w:pStyle w:val="Textbody"/>
+        <w:rPr>
+          <w:rFonts w:ascii="Times New Roman" w:hAnsi="Times New Roman" w:cs="Times New Roman"/>
+        </w:rPr>
+      </w:pPr>
+    </w:p>
+    <w:p>
+      <w:pPr>
+        <w:pStyle w:val="Textbody"/>
+        <w:rPr>
+          <w:rFonts w:ascii="Times New Roman" w:hAnsi="Times New Roman" w:cs="Times New Roman"/>
+          <w:b/>
+          <w:bCs/>
+        </w:rPr>
+      </w:pPr>
+      <w:r>
+        <w:rPr>
+          <w:rFonts w:ascii="Times New Roman" w:hAnsi="Times New Roman" w:cs="Times New Roman"/>
+          <w:b/>
+          <w:bCs/>
+        </w:rPr>
         <w:t xml:space="preserve">Función: </w:t>
       </w:r>
       <w:proofErr w:type="spellStart"/>
@@ -12873,7 +13524,7 @@
           <w:b/>
           <w:bCs/>
         </w:rPr>
-        <w:t>registrarReserva</w:t>
+        <w:t>mostrarNoticias</w:t>
       </w:r>
       <w:proofErr w:type="spellEnd"/>
     </w:p>
@@ -12896,7 +13547,7 @@
         <w:rPr>
           <w:rFonts w:ascii="Times New Roman" w:hAnsi="Times New Roman" w:cs="Times New Roman"/>
         </w:rPr>
-        <w:t xml:space="preserve"> Reserva,</w:t>
+        <w:t xml:space="preserve"> Submódulo de recibimiento de noticias</w:t>
       </w:r>
     </w:p>
     <w:p>
@@ -12910,650 +13561,7 @@
         <w:rPr>
           <w:rFonts w:ascii="Times New Roman" w:hAnsi="Times New Roman" w:cs="Times New Roman"/>
         </w:rPr>
-        <w:t>Inserta un nuevo registro de reserva en la base de datos con los datos de usuario, recurso, fecha y horario, asegurando integridad referencial y confirmando el enví</w:t>
-      </w:r>
-      <w:r>
-        <w:rPr>
-          <w:rFonts w:ascii="Times New Roman" w:hAnsi="Times New Roman" w:cs="Times New Roman"/>
-        </w:rPr>
-        <w:t>o</w:t>
-      </w:r>
-      <w:r>
-        <w:rPr>
-          <w:rFonts w:ascii="Times New Roman" w:hAnsi="Times New Roman" w:cs="Times New Roman"/>
-        </w:rPr>
-        <w:t>.</w:t>
-      </w:r>
-    </w:p>
-    <w:p>
-      <w:pPr>
-        <w:pStyle w:val="Textbody"/>
-        <w:rPr>
-          <w:rFonts w:ascii="Times New Roman" w:hAnsi="Times New Roman" w:cs="Times New Roman"/>
-        </w:rPr>
-      </w:pPr>
-    </w:p>
-    <w:p>
-      <w:pPr>
-        <w:pStyle w:val="Textbody"/>
-        <w:rPr>
-          <w:rFonts w:ascii="Times New Roman" w:hAnsi="Times New Roman" w:cs="Times New Roman"/>
-          <w:b/>
-          <w:bCs/>
-        </w:rPr>
-      </w:pPr>
-      <w:r>
-        <w:rPr>
-          <w:rFonts w:ascii="Times New Roman" w:hAnsi="Times New Roman" w:cs="Times New Roman"/>
-          <w:b/>
-          <w:bCs/>
-        </w:rPr>
-        <w:t xml:space="preserve">Función: </w:t>
-      </w:r>
-      <w:proofErr w:type="spellStart"/>
-      <w:r>
-        <w:rPr>
-          <w:rFonts w:ascii="Times New Roman" w:hAnsi="Times New Roman" w:cs="Times New Roman"/>
-          <w:b/>
-          <w:bCs/>
-        </w:rPr>
-        <w:t>consultarVideojuegos</w:t>
-      </w:r>
-      <w:proofErr w:type="spellEnd"/>
-    </w:p>
-    <w:p>
-      <w:pPr>
-        <w:pStyle w:val="Textbody"/>
-        <w:rPr>
-          <w:rFonts w:ascii="Times New Roman" w:hAnsi="Times New Roman" w:cs="Times New Roman"/>
-        </w:rPr>
-      </w:pPr>
-      <w:r>
-        <w:rPr>
-          <w:rFonts w:ascii="Times New Roman" w:hAnsi="Times New Roman" w:cs="Times New Roman"/>
-          <w:b/>
-          <w:bCs/>
-        </w:rPr>
-        <w:t>Módulos asociados:</w:t>
-      </w:r>
-      <w:r>
-        <w:rPr>
-          <w:rFonts w:ascii="Times New Roman" w:hAnsi="Times New Roman" w:cs="Times New Roman"/>
-        </w:rPr>
-        <w:t xml:space="preserve"> Submódulo de consulta de videojuegos</w:t>
-      </w:r>
-    </w:p>
-    <w:p>
-      <w:pPr>
-        <w:pStyle w:val="Textbody"/>
-        <w:rPr>
-          <w:rFonts w:ascii="Times New Roman" w:hAnsi="Times New Roman" w:cs="Times New Roman"/>
-        </w:rPr>
-      </w:pPr>
-      <w:r>
-        <w:rPr>
-          <w:rFonts w:ascii="Times New Roman" w:hAnsi="Times New Roman" w:cs="Times New Roman"/>
-        </w:rPr>
-        <w:t>Realiza una petición tipo GET a la API para obtener información de videojuegos, incluyendo nombre, foto,</w:t>
-      </w:r>
-      <w:r>
-        <w:rPr>
-          <w:rFonts w:ascii="Times New Roman" w:hAnsi="Times New Roman" w:cs="Times New Roman"/>
-        </w:rPr>
-        <w:t xml:space="preserve"> </w:t>
-      </w:r>
-      <w:r>
-        <w:rPr>
-          <w:rFonts w:ascii="Times New Roman" w:hAnsi="Times New Roman" w:cs="Times New Roman"/>
-        </w:rPr>
-        <w:t xml:space="preserve">versión, recurso asociado y descripción, utilizando como parámetros los resultados generados por la función </w:t>
-      </w:r>
-      <w:proofErr w:type="spellStart"/>
-      <w:r>
-        <w:rPr>
-          <w:rFonts w:ascii="Times New Roman" w:hAnsi="Times New Roman" w:cs="Times New Roman"/>
-          <w:b/>
-          <w:bCs/>
-        </w:rPr>
-        <w:t>filtrarVideojuegos</w:t>
-      </w:r>
-      <w:proofErr w:type="spellEnd"/>
-      <w:r>
-        <w:rPr>
-          <w:rFonts w:ascii="Times New Roman" w:hAnsi="Times New Roman" w:cs="Times New Roman"/>
-          <w:b/>
-          <w:bCs/>
-        </w:rPr>
-        <w:t xml:space="preserve"> </w:t>
-      </w:r>
-    </w:p>
-    <w:p>
-      <w:pPr>
-        <w:pStyle w:val="Textbody"/>
-        <w:rPr>
-          <w:rFonts w:ascii="Times New Roman" w:hAnsi="Times New Roman" w:cs="Times New Roman"/>
-          <w:b/>
-          <w:bCs/>
-        </w:rPr>
-      </w:pPr>
-    </w:p>
-    <w:p>
-      <w:pPr>
-        <w:pStyle w:val="Textbody"/>
-        <w:rPr>
-          <w:rFonts w:ascii="Times New Roman" w:hAnsi="Times New Roman" w:cs="Times New Roman"/>
-          <w:b/>
-          <w:bCs/>
-        </w:rPr>
-      </w:pPr>
-      <w:r>
-        <w:rPr>
-          <w:rFonts w:ascii="Times New Roman" w:hAnsi="Times New Roman" w:cs="Times New Roman"/>
-          <w:b/>
-          <w:bCs/>
-        </w:rPr>
-        <w:t xml:space="preserve">Función: </w:t>
-      </w:r>
-      <w:proofErr w:type="spellStart"/>
-      <w:r>
-        <w:rPr>
-          <w:rFonts w:ascii="Times New Roman" w:hAnsi="Times New Roman" w:cs="Times New Roman"/>
-          <w:b/>
-          <w:bCs/>
-        </w:rPr>
-        <w:t>filtrarVideojuegos</w:t>
-      </w:r>
-      <w:proofErr w:type="spellEnd"/>
-    </w:p>
-    <w:p>
-      <w:pPr>
-        <w:pStyle w:val="Textbody"/>
-        <w:rPr>
-          <w:rFonts w:ascii="Times New Roman" w:hAnsi="Times New Roman" w:cs="Times New Roman"/>
-        </w:rPr>
-      </w:pPr>
-      <w:r>
-        <w:rPr>
-          <w:rFonts w:ascii="Times New Roman" w:hAnsi="Times New Roman" w:cs="Times New Roman"/>
-          <w:b/>
-          <w:bCs/>
-        </w:rPr>
-        <w:t>Módulos asociados:</w:t>
-      </w:r>
-      <w:r>
-        <w:rPr>
-          <w:rFonts w:ascii="Times New Roman" w:hAnsi="Times New Roman" w:cs="Times New Roman"/>
-        </w:rPr>
-        <w:t xml:space="preserve"> </w:t>
-      </w:r>
-      <w:r>
-        <w:rPr>
-          <w:rFonts w:ascii="Times New Roman" w:hAnsi="Times New Roman" w:cs="Times New Roman"/>
-        </w:rPr>
-        <w:t>submódulo</w:t>
-      </w:r>
-      <w:r>
-        <w:rPr>
-          <w:rFonts w:ascii="Times New Roman" w:hAnsi="Times New Roman" w:cs="Times New Roman"/>
-        </w:rPr>
-        <w:t xml:space="preserve"> de </w:t>
-      </w:r>
-      <w:r>
-        <w:rPr>
-          <w:rFonts w:ascii="Times New Roman" w:hAnsi="Times New Roman" w:cs="Times New Roman"/>
-        </w:rPr>
-        <w:t>consulta</w:t>
-      </w:r>
-      <w:r>
-        <w:rPr>
-          <w:rFonts w:ascii="Times New Roman" w:hAnsi="Times New Roman" w:cs="Times New Roman"/>
-        </w:rPr>
-        <w:t xml:space="preserve"> de videojuegos</w:t>
-      </w:r>
-    </w:p>
-    <w:p>
-      <w:pPr>
-        <w:pStyle w:val="Textbody"/>
-        <w:rPr>
-          <w:rFonts w:ascii="Times New Roman" w:hAnsi="Times New Roman" w:cs="Times New Roman"/>
-        </w:rPr>
-      </w:pPr>
-      <w:r>
-        <w:rPr>
-          <w:rFonts w:ascii="Times New Roman" w:hAnsi="Times New Roman" w:cs="Times New Roman"/>
-        </w:rPr>
-        <w:t xml:space="preserve">Procesa, con base en filtros definidos en el DOM, un conjunto de parámetros que son enviados a la función </w:t>
-      </w:r>
-      <w:proofErr w:type="spellStart"/>
-      <w:r>
-        <w:rPr>
-          <w:rFonts w:ascii="Times New Roman" w:hAnsi="Times New Roman" w:cs="Times New Roman"/>
-          <w:b/>
-          <w:bCs/>
-        </w:rPr>
-        <w:t>consultarVideojuegos</w:t>
-      </w:r>
-      <w:proofErr w:type="spellEnd"/>
-      <w:r>
-        <w:rPr>
-          <w:rFonts w:ascii="Times New Roman" w:hAnsi="Times New Roman" w:cs="Times New Roman"/>
-        </w:rPr>
-        <w:t xml:space="preserve"> para la ejecución de consultas personalizadas, permitiendo obtener información de videojuegos de forma filtrada y estructurada.</w:t>
-      </w:r>
-    </w:p>
-    <w:p>
-      <w:pPr>
-        <w:pStyle w:val="Textbody"/>
-        <w:rPr>
-          <w:rFonts w:ascii="Times New Roman" w:hAnsi="Times New Roman" w:cs="Times New Roman"/>
-          <w:b/>
-          <w:bCs/>
-        </w:rPr>
-      </w:pPr>
-    </w:p>
-    <w:p>
-      <w:pPr>
-        <w:pStyle w:val="Textbody"/>
-        <w:rPr>
-          <w:rFonts w:ascii="Times New Roman" w:hAnsi="Times New Roman" w:cs="Times New Roman"/>
-          <w:b/>
-          <w:bCs/>
-        </w:rPr>
-      </w:pPr>
-      <w:r>
-        <w:rPr>
-          <w:rFonts w:ascii="Times New Roman" w:hAnsi="Times New Roman" w:cs="Times New Roman"/>
-          <w:b/>
-          <w:bCs/>
-        </w:rPr>
-        <w:t xml:space="preserve">Función: </w:t>
-      </w:r>
-      <w:proofErr w:type="spellStart"/>
-      <w:r>
-        <w:rPr>
-          <w:rFonts w:ascii="Times New Roman" w:hAnsi="Times New Roman" w:cs="Times New Roman"/>
-          <w:b/>
-          <w:bCs/>
-        </w:rPr>
-        <w:t>registrarNuevoUsuario</w:t>
-      </w:r>
-      <w:proofErr w:type="spellEnd"/>
-    </w:p>
-    <w:p>
-      <w:pPr>
-        <w:pStyle w:val="Textbody"/>
-        <w:rPr>
-          <w:rFonts w:ascii="Times New Roman" w:hAnsi="Times New Roman" w:cs="Times New Roman"/>
-        </w:rPr>
-      </w:pPr>
-      <w:r>
-        <w:rPr>
-          <w:rFonts w:ascii="Times New Roman" w:hAnsi="Times New Roman" w:cs="Times New Roman"/>
-          <w:b/>
-          <w:bCs/>
-        </w:rPr>
-        <w:t>Módulos asociados:</w:t>
-      </w:r>
-      <w:r>
-        <w:rPr>
-          <w:rFonts w:ascii="Times New Roman" w:hAnsi="Times New Roman" w:cs="Times New Roman"/>
-        </w:rPr>
-        <w:t xml:space="preserve"> </w:t>
-      </w:r>
-      <w:proofErr w:type="spellStart"/>
-      <w:r>
-        <w:rPr>
-          <w:rFonts w:ascii="Times New Roman" w:hAnsi="Times New Roman" w:cs="Times New Roman"/>
-        </w:rPr>
-        <w:t>Login</w:t>
-      </w:r>
-      <w:proofErr w:type="spellEnd"/>
-    </w:p>
-    <w:p>
-      <w:pPr>
-        <w:pStyle w:val="Textbody"/>
-        <w:rPr>
-          <w:rFonts w:ascii="Times New Roman" w:hAnsi="Times New Roman" w:cs="Times New Roman"/>
-        </w:rPr>
-      </w:pPr>
-      <w:r>
-        <w:rPr>
-          <w:rFonts w:ascii="Times New Roman" w:hAnsi="Times New Roman" w:cs="Times New Roman"/>
-        </w:rPr>
-        <w:t>Realiza una petición tipo POST a la API para crear un nuevo registro de usuario en la base de datos, enviando información como nombre, correo, facultad, carnet institucional, cédula y carrera</w:t>
-      </w:r>
-    </w:p>
-    <w:p>
-      <w:pPr>
-        <w:pStyle w:val="Textbody"/>
-        <w:rPr>
-          <w:rFonts w:ascii="Times New Roman" w:hAnsi="Times New Roman" w:cs="Times New Roman"/>
-        </w:rPr>
-      </w:pPr>
-    </w:p>
-    <w:p>
-      <w:pPr>
-        <w:pStyle w:val="Textbody"/>
-        <w:rPr>
-          <w:rFonts w:ascii="Times New Roman" w:hAnsi="Times New Roman" w:cs="Times New Roman"/>
-          <w:b/>
-          <w:bCs/>
-        </w:rPr>
-      </w:pPr>
-      <w:r>
-        <w:rPr>
-          <w:rFonts w:ascii="Times New Roman" w:hAnsi="Times New Roman" w:cs="Times New Roman"/>
-          <w:b/>
-          <w:bCs/>
-        </w:rPr>
-        <w:t xml:space="preserve">Función: </w:t>
-      </w:r>
-      <w:proofErr w:type="spellStart"/>
-      <w:r>
-        <w:rPr>
-          <w:rFonts w:ascii="Times New Roman" w:hAnsi="Times New Roman" w:cs="Times New Roman"/>
-          <w:b/>
-          <w:bCs/>
-        </w:rPr>
-        <w:t>consultarEquipos</w:t>
-      </w:r>
-      <w:proofErr w:type="spellEnd"/>
-    </w:p>
-    <w:p>
-      <w:pPr>
-        <w:pStyle w:val="Textbody"/>
-        <w:rPr>
-          <w:rFonts w:ascii="Times New Roman" w:hAnsi="Times New Roman" w:cs="Times New Roman"/>
-        </w:rPr>
-      </w:pPr>
-      <w:r>
-        <w:rPr>
-          <w:rFonts w:ascii="Times New Roman" w:hAnsi="Times New Roman" w:cs="Times New Roman"/>
-          <w:b/>
-          <w:bCs/>
-        </w:rPr>
-        <w:t xml:space="preserve">Módulos asociados: </w:t>
-      </w:r>
-      <w:r>
-        <w:rPr>
-          <w:rFonts w:ascii="Times New Roman" w:hAnsi="Times New Roman" w:cs="Times New Roman"/>
-        </w:rPr>
-        <w:t>Inventarios</w:t>
-      </w:r>
-    </w:p>
-    <w:p>
-      <w:pPr>
-        <w:pStyle w:val="Textbody"/>
-        <w:rPr>
-          <w:rFonts w:ascii="Times New Roman" w:hAnsi="Times New Roman" w:cs="Times New Roman"/>
-        </w:rPr>
-      </w:pPr>
-      <w:r>
-        <w:rPr>
-          <w:rFonts w:ascii="Times New Roman" w:hAnsi="Times New Roman" w:cs="Times New Roman"/>
-        </w:rPr>
-        <w:t xml:space="preserve">Realiza una petición tipo GET a la API para obtener información de los equipos, incluyendo estado, tipo, disponibilidad, periféricos, videojuegos y características asociadas, utilizando como parámetros los resultados generados por la función de </w:t>
-      </w:r>
-      <w:proofErr w:type="spellStart"/>
-      <w:r>
-        <w:rPr>
-          <w:rFonts w:ascii="Times New Roman" w:hAnsi="Times New Roman" w:cs="Times New Roman"/>
-          <w:b/>
-          <w:bCs/>
-        </w:rPr>
-        <w:t>filtrosEquipos</w:t>
-      </w:r>
-      <w:proofErr w:type="spellEnd"/>
-    </w:p>
-    <w:p>
-      <w:pPr>
-        <w:pStyle w:val="Textbody"/>
-        <w:rPr>
-          <w:rFonts w:ascii="Times New Roman" w:hAnsi="Times New Roman" w:cs="Times New Roman"/>
-        </w:rPr>
-      </w:pPr>
-    </w:p>
-    <w:p>
-      <w:pPr>
-        <w:pStyle w:val="Textbody"/>
-        <w:rPr>
-          <w:rFonts w:ascii="Times New Roman" w:hAnsi="Times New Roman" w:cs="Times New Roman"/>
-          <w:b/>
-          <w:bCs/>
-        </w:rPr>
-      </w:pPr>
-      <w:r>
-        <w:rPr>
-          <w:rFonts w:ascii="Times New Roman" w:hAnsi="Times New Roman" w:cs="Times New Roman"/>
-          <w:b/>
-          <w:bCs/>
-        </w:rPr>
-        <w:t xml:space="preserve">Función: </w:t>
-      </w:r>
-      <w:proofErr w:type="spellStart"/>
-      <w:r>
-        <w:rPr>
-          <w:rFonts w:ascii="Times New Roman" w:hAnsi="Times New Roman" w:cs="Times New Roman"/>
-          <w:b/>
-          <w:bCs/>
-        </w:rPr>
-        <w:t>filtrosEquipos</w:t>
-      </w:r>
-      <w:proofErr w:type="spellEnd"/>
-    </w:p>
-    <w:p>
-      <w:pPr>
-        <w:pStyle w:val="Textbody"/>
-        <w:rPr>
-          <w:rFonts w:ascii="Times New Roman" w:hAnsi="Times New Roman" w:cs="Times New Roman"/>
-        </w:rPr>
-      </w:pPr>
-      <w:r>
-        <w:rPr>
-          <w:rFonts w:ascii="Times New Roman" w:hAnsi="Times New Roman" w:cs="Times New Roman"/>
-          <w:b/>
-          <w:bCs/>
-        </w:rPr>
-        <w:t>Módulos asociados:</w:t>
-      </w:r>
-      <w:r>
-        <w:rPr>
-          <w:rFonts w:ascii="Times New Roman" w:hAnsi="Times New Roman" w:cs="Times New Roman"/>
-        </w:rPr>
-        <w:t xml:space="preserve"> Inventarios</w:t>
-      </w:r>
-    </w:p>
-    <w:p>
-      <w:pPr>
-        <w:pStyle w:val="Textbody"/>
-        <w:rPr>
-          <w:rFonts w:ascii="Times New Roman" w:hAnsi="Times New Roman" w:cs="Times New Roman"/>
-        </w:rPr>
-      </w:pPr>
-      <w:r>
-        <w:rPr>
-          <w:rFonts w:ascii="Times New Roman" w:hAnsi="Times New Roman" w:cs="Times New Roman"/>
-        </w:rPr>
-        <w:t xml:space="preserve">Procesa, con base en filtros definidos en el DOM, un conjunto de parámetros que son enviados a la función </w:t>
-      </w:r>
-      <w:proofErr w:type="spellStart"/>
-      <w:r>
-        <w:rPr>
-          <w:rFonts w:ascii="Times New Roman" w:hAnsi="Times New Roman" w:cs="Times New Roman"/>
-          <w:b/>
-          <w:bCs/>
-        </w:rPr>
-        <w:t>consultarEquipo</w:t>
-      </w:r>
-      <w:r>
-        <w:rPr>
-          <w:rFonts w:ascii="Times New Roman" w:hAnsi="Times New Roman" w:cs="Times New Roman"/>
-        </w:rPr>
-        <w:t>s</w:t>
-      </w:r>
-      <w:proofErr w:type="spellEnd"/>
-      <w:r>
-        <w:rPr>
-          <w:rFonts w:ascii="Times New Roman" w:hAnsi="Times New Roman" w:cs="Times New Roman"/>
-        </w:rPr>
-        <w:t xml:space="preserve"> para la ejecución de consultas personalizadas</w:t>
-      </w:r>
-    </w:p>
-    <w:p>
-      <w:pPr>
-        <w:pStyle w:val="Textbody"/>
-        <w:rPr>
-          <w:rFonts w:ascii="Times New Roman" w:hAnsi="Times New Roman" w:cs="Times New Roman"/>
-        </w:rPr>
-      </w:pPr>
-    </w:p>
-    <w:p>
-      <w:pPr>
-        <w:pStyle w:val="Textbody"/>
-        <w:rPr>
-          <w:rFonts w:ascii="Times New Roman" w:hAnsi="Times New Roman" w:cs="Times New Roman"/>
-          <w:b/>
-          <w:bCs/>
-        </w:rPr>
-      </w:pPr>
-      <w:r>
-        <w:rPr>
-          <w:rFonts w:ascii="Times New Roman" w:hAnsi="Times New Roman" w:cs="Times New Roman"/>
-          <w:b/>
-          <w:bCs/>
-        </w:rPr>
-        <w:t xml:space="preserve">Función: </w:t>
-      </w:r>
-      <w:proofErr w:type="spellStart"/>
-      <w:r>
-        <w:rPr>
-          <w:rFonts w:ascii="Times New Roman" w:hAnsi="Times New Roman" w:cs="Times New Roman"/>
-          <w:b/>
-          <w:bCs/>
-        </w:rPr>
-        <w:t>enviarNoticias</w:t>
-      </w:r>
-      <w:proofErr w:type="spellEnd"/>
-    </w:p>
-    <w:p>
-      <w:pPr>
-        <w:pStyle w:val="Textbody"/>
-        <w:rPr>
-          <w:rFonts w:ascii="Times New Roman" w:hAnsi="Times New Roman" w:cs="Times New Roman"/>
-        </w:rPr>
-      </w:pPr>
-      <w:r>
-        <w:rPr>
-          <w:rFonts w:ascii="Times New Roman" w:hAnsi="Times New Roman" w:cs="Times New Roman"/>
-          <w:b/>
-          <w:bCs/>
-        </w:rPr>
-        <w:t>Módulos asociados:</w:t>
-      </w:r>
-      <w:r>
-        <w:rPr>
-          <w:rFonts w:ascii="Times New Roman" w:hAnsi="Times New Roman" w:cs="Times New Roman"/>
-        </w:rPr>
-        <w:t xml:space="preserve"> Submódulo de adjunción de noticias</w:t>
-      </w:r>
-    </w:p>
-    <w:p>
-      <w:pPr>
-        <w:pStyle w:val="Textbody"/>
-        <w:rPr>
-          <w:rFonts w:ascii="Times New Roman" w:hAnsi="Times New Roman" w:cs="Times New Roman"/>
-        </w:rPr>
-      </w:pPr>
-      <w:r>
-        <w:rPr>
-          <w:rFonts w:ascii="Times New Roman" w:hAnsi="Times New Roman" w:cs="Times New Roman"/>
-        </w:rPr>
-        <w:t>Procesa, a través del DOM, la información ingresada por el administrador (título, descripción, imágenes y datos asociados), generando una clave de validación de recepción y realizando una petición tipo POST a la API para almacenar la noticia</w:t>
-      </w:r>
-      <w:r>
-        <w:rPr>
-          <w:rFonts w:ascii="Times New Roman" w:hAnsi="Times New Roman" w:cs="Times New Roman"/>
-        </w:rPr>
-        <w:t>.</w:t>
-      </w:r>
-    </w:p>
-    <w:p>
-      <w:pPr>
-        <w:pStyle w:val="Textbody"/>
-        <w:rPr>
-          <w:rFonts w:ascii="Times New Roman" w:hAnsi="Times New Roman" w:cs="Times New Roman"/>
-        </w:rPr>
-      </w:pPr>
-    </w:p>
-    <w:p>
-      <w:pPr>
-        <w:pStyle w:val="Textbody"/>
-        <w:rPr>
-          <w:rFonts w:ascii="Times New Roman" w:hAnsi="Times New Roman" w:cs="Times New Roman"/>
-          <w:b/>
-          <w:bCs/>
-        </w:rPr>
-      </w:pPr>
-      <w:r>
-        <w:rPr>
-          <w:rFonts w:ascii="Times New Roman" w:hAnsi="Times New Roman" w:cs="Times New Roman"/>
-          <w:b/>
-          <w:bCs/>
-        </w:rPr>
-        <w:t xml:space="preserve">Función: </w:t>
-      </w:r>
-      <w:proofErr w:type="spellStart"/>
-      <w:r>
-        <w:rPr>
-          <w:rFonts w:ascii="Times New Roman" w:hAnsi="Times New Roman" w:cs="Times New Roman"/>
-          <w:b/>
-          <w:bCs/>
-        </w:rPr>
-        <w:t>mostrarNoticias</w:t>
-      </w:r>
-      <w:proofErr w:type="spellEnd"/>
-    </w:p>
-    <w:p>
-      <w:pPr>
-        <w:pStyle w:val="Textbody"/>
-        <w:rPr>
-          <w:rFonts w:ascii="Times New Roman" w:hAnsi="Times New Roman" w:cs="Times New Roman"/>
-        </w:rPr>
-      </w:pPr>
-      <w:r>
-        <w:rPr>
-          <w:rFonts w:ascii="Times New Roman" w:hAnsi="Times New Roman" w:cs="Times New Roman"/>
-          <w:b/>
-          <w:bCs/>
-        </w:rPr>
-        <w:t>Módulos asociados:</w:t>
-      </w:r>
-      <w:r>
-        <w:rPr>
-          <w:rFonts w:ascii="Times New Roman" w:hAnsi="Times New Roman" w:cs="Times New Roman"/>
-        </w:rPr>
-        <w:t xml:space="preserve"> Submódulo de recibimiento de noticias</w:t>
-      </w:r>
-    </w:p>
-    <w:p>
-      <w:pPr>
-        <w:pStyle w:val="Textbody"/>
-        <w:rPr>
-          <w:rFonts w:ascii="Times New Roman" w:hAnsi="Times New Roman" w:cs="Times New Roman"/>
-        </w:rPr>
-      </w:pPr>
-      <w:r>
-        <w:rPr>
-          <w:rFonts w:ascii="Times New Roman" w:hAnsi="Times New Roman" w:cs="Times New Roman"/>
-        </w:rPr>
-        <w:t xml:space="preserve">Realiza una petición tipo GET a la API para obtener las noticias disponibles, validando cuáles han sido </w:t>
-      </w:r>
-      <w:r>
-        <w:rPr>
-          <w:rFonts w:ascii="Times New Roman" w:hAnsi="Times New Roman" w:cs="Times New Roman"/>
-        </w:rPr>
-        <w:lastRenderedPageBreak/>
-        <w:t>recibidas por el usuario y cuáles no, y renderiza en el DOM las últimas noticias mediante notificaciones</w:t>
+        <w:t>Realiza una petición tipo GET a la API para obtener las noticias disponibles, validando cuáles han sido recibidas por el usuario y cuáles no, y renderiza en el DOM las últimas noticias mediante notificaciones</w:t>
       </w:r>
     </w:p>
     <w:p>
@@ -14409,7 +14417,6 @@
           <w:sz w:val="22"/>
           <w:szCs w:val="22"/>
         </w:rPr>
-        <w:lastRenderedPageBreak/>
         <w:t xml:space="preserve">HTML </w:t>
       </w:r>
     </w:p>
@@ -15201,6 +15208,7 @@
           <w:sz w:val="22"/>
           <w:szCs w:val="22"/>
         </w:rPr>
+        <w:lastRenderedPageBreak/>
         <w:t>BCrypt</w:t>
       </w:r>
       <w:proofErr w:type="spellEnd"/>
@@ -15350,7 +15358,6 @@
           <w:sz w:val="22"/>
           <w:szCs w:val="22"/>
         </w:rPr>
-        <w:lastRenderedPageBreak/>
         <w:t>Mantenimiento</w:t>
       </w:r>
     </w:p>

</xml_diff>